<commit_message>
Bind agricultural operations to profiles
</commit_message>
<xml_diff>
--- a/docs/traceability-user-guide/Uninus Calendar 產銷履歷輔助系統使用操作說明.docx
+++ b/docs/traceability-user-guide/Uninus Calendar 產銷履歷輔助系統使用操作說明.docx
@@ -126,7 +126,7 @@
                 <w:b w:val="0"/>
                 <w:sz w:val="17"/>
               </w:rPr>
-              <w:t>Uninus Calendar Service Scheduler v0.5.6</w:t>
+              <w:t>Uninus Calendar Service Scheduler v0.5.8</w:t>
             </w:r>
           </w:p>
         </w:tc>
@@ -4626,7 +4626,7 @@
         <w:tc>
           <w:tcPr>
             <w:tcW w:type="dxa" w:w="10224"/>
-            <w:shd w:fill="FFF4D6"/>
+            <w:shd w:fill="DFF3E6"/>
           </w:tcPr>
           <w:p>
             <w:r>
@@ -4634,14 +4634,14 @@
                 <w:b/>
                 <w:color w:val="17324D"/>
               </w:rPr>
-              <w:t>目前 v0.5.6 UI 狀態</w:t>
+              <w:t>目前 v0.5.8 UI 狀態</w:t>
               <w:br/>
             </w:r>
             <w:r>
               <w:rPr>
                 <w:sz w:val="18"/>
               </w:rPr>
-              <w:t>Operation Profile 管理頁已可建立／編輯 Profile、entities、Actions 與 evidence policy；後端 AgriOperation 已具備 profile_id、start_actions、end_actions 欄位。但目前農務作業編輯頁尚未呈現 Operation Profile 綁定欄位。建立正式 SOP 時請將此項列為上線前檢查，避免把後端能力誤認為現場 UI 已完整開放。</w:t>
+              <w:t>Operation Profile 管理頁可建立／編輯 Profile、entities、Actions 與 evidence policy；農務作業快速表單、Calendar 農務行程表單及工作台作業詳細資料均可選擇 Operation Profile。選取後會帶入 Observed entities 與預設 Start／End Actions，儲存及重開仍保留綁定；後端另會驗證 Profile 必須屬於該生產週期的場區。</w:t>
             </w:r>
           </w:p>
         </w:tc>
@@ -9111,7 +9111,7 @@
                 <w:b w:val="0"/>
                 <w:sz w:val="17"/>
               </w:rPr>
-              <w:t>Operation Profile 看得到但作業頁無法綁定</w:t>
+              <w:t>Operation Profile 未出現在作業選單</w:t>
             </w:r>
           </w:p>
         </w:tc>
@@ -9128,7 +9128,7 @@
                 <w:b w:val="0"/>
                 <w:sz w:val="17"/>
               </w:rPr>
-              <w:t>v0.5.6 live UI 尚未呈現 profile binding 欄位</w:t>
+              <w:t>Profile 所屬場區與生產週期場區不同</w:t>
             </w:r>
           </w:p>
         </w:tc>
@@ -9145,7 +9145,7 @@
                 <w:b w:val="0"/>
                 <w:sz w:val="17"/>
               </w:rPr>
-              <w:t>依發行版本確認；此功能完成前以後端資料與 Profile 管理頁為準</w:t>
+              <w:t>確認 Profile 與週期使用相同場區；系統不允許跨場區綁定</w:t>
             </w:r>
           </w:p>
         </w:tc>
@@ -9572,7 +9572,7 @@
     </w:p>
     <w:p>
       <w:r>
-        <w:t>本版依專案 v0.5.6、manifest、agri.py 資料模型、v0.5.6 live Home Assistant UI 與 E2E 驗證結果重寫。畫面或欄位若在後續版本變更，應同步更新本文件的適用版本、欄位表、E2E 清單與截圖。</w:t>
+        <w:t>本版依專案 v0.5.8、manifest、agri.py 資料模型、v0.5.8 live Home Assistant UI 與 E2E 驗證結果重寫。畫面或欄位若在後續版本變更，應同步更新本文件的適用版本、欄位表、E2E 清單與截圖。</w:t>
       </w:r>
     </w:p>
     <w:sectPr>
@@ -9625,7 +9625,7 @@
         <w:color w:val="646E78"/>
         <w:sz w:val="16"/>
       </w:rPr>
-      <w:t>Uninus Calendar 產銷履歷輔助系統｜v0.5.6</w:t>
+      <w:t>Uninus Calendar 產銷履歷輔助系統｜v0.5.8</w:t>
     </w:r>
   </w:p>
 </w:hdr>

</xml_diff>